<commit_message>
Update curriculum assignments with enhanced content and add new modules
Add how_to_screenshot and independent_learning guides. Update all
assignment docs across fundamentals, Pi, Flutter, AI chatbots, robotics,
and capstone with expanded instructions and resources.

Co-Authored-By: Claude Opus 4.6 (1M context) <noreply@anthropic.com>
</commit_message>
<xml_diff>
--- a/capstone/capstone_proposal_template.docx
+++ b/capstone/capstone_proposal_template.docx
@@ -72,12 +72,6 @@
         <w:gridCol w:w="6560"/>
       </w:tblGrid>
       <w:tr>
-        <w:tblPrEx>
-          <w:tblCellMar>
-            <w:top w:w="0" w:type="dxa"/>
-            <w:bottom w:w="0" w:type="dxa"/>
-          </w:tblCellMar>
-        </w:tblPrEx>
         <w:tc>
           <w:tcPr>
             <w:tcW w:w="2800" w:type="dxa"/>
@@ -139,12 +133,6 @@
         </w:tc>
       </w:tr>
       <w:tr>
-        <w:tblPrEx>
-          <w:tblCellMar>
-            <w:top w:w="0" w:type="dxa"/>
-            <w:bottom w:w="0" w:type="dxa"/>
-          </w:tblCellMar>
-        </w:tblPrEx>
         <w:tc>
           <w:tcPr>
             <w:tcW w:w="2800" w:type="dxa"/>
@@ -206,12 +194,6 @@
         </w:tc>
       </w:tr>
       <w:tr>
-        <w:tblPrEx>
-          <w:tblCellMar>
-            <w:top w:w="0" w:type="dxa"/>
-            <w:bottom w:w="0" w:type="dxa"/>
-          </w:tblCellMar>
-        </w:tblPrEx>
         <w:tc>
           <w:tcPr>
             <w:tcW w:w="2800" w:type="dxa"/>
@@ -273,12 +255,6 @@
         </w:tc>
       </w:tr>
       <w:tr>
-        <w:tblPrEx>
-          <w:tblCellMar>
-            <w:top w:w="0" w:type="dxa"/>
-            <w:bottom w:w="0" w:type="dxa"/>
-          </w:tblCellMar>
-        </w:tblPrEx>
         <w:tc>
           <w:tcPr>
             <w:tcW w:w="2800" w:type="dxa"/>
@@ -437,12 +413,6 @@
         <w:gridCol w:w="4680"/>
       </w:tblGrid>
       <w:tr>
-        <w:tblPrEx>
-          <w:tblCellMar>
-            <w:top w:w="0" w:type="dxa"/>
-            <w:bottom w:w="0" w:type="dxa"/>
-          </w:tblCellMar>
-        </w:tblPrEx>
         <w:tc>
           <w:tcPr>
             <w:tcW w:w="4680" w:type="dxa"/>
@@ -761,12 +731,6 @@
         <w:gridCol w:w="7360"/>
       </w:tblGrid>
       <w:tr>
-        <w:tblPrEx>
-          <w:tblCellMar>
-            <w:top w:w="0" w:type="dxa"/>
-            <w:bottom w:w="0" w:type="dxa"/>
-          </w:tblCellMar>
-        </w:tblPrEx>
         <w:tc>
           <w:tcPr>
             <w:tcW w:w="2000" w:type="dxa"/>
@@ -826,12 +790,6 @@
         </w:tc>
       </w:tr>
       <w:tr>
-        <w:tblPrEx>
-          <w:tblCellMar>
-            <w:top w:w="0" w:type="dxa"/>
-            <w:bottom w:w="0" w:type="dxa"/>
-          </w:tblCellMar>
-        </w:tblPrEx>
         <w:tc>
           <w:tcPr>
             <w:tcW w:w="2000" w:type="dxa"/>
@@ -893,12 +851,6 @@
         </w:tc>
       </w:tr>
       <w:tr>
-        <w:tblPrEx>
-          <w:tblCellMar>
-            <w:top w:w="0" w:type="dxa"/>
-            <w:bottom w:w="0" w:type="dxa"/>
-          </w:tblCellMar>
-        </w:tblPrEx>
         <w:tc>
           <w:tcPr>
             <w:tcW w:w="2000" w:type="dxa"/>
@@ -960,12 +912,6 @@
         </w:tc>
       </w:tr>
       <w:tr>
-        <w:tblPrEx>
-          <w:tblCellMar>
-            <w:top w:w="0" w:type="dxa"/>
-            <w:bottom w:w="0" w:type="dxa"/>
-          </w:tblCellMar>
-        </w:tblPrEx>
         <w:tc>
           <w:tcPr>
             <w:tcW w:w="2000" w:type="dxa"/>
@@ -1027,12 +973,6 @@
         </w:tc>
       </w:tr>
       <w:tr>
-        <w:tblPrEx>
-          <w:tblCellMar>
-            <w:top w:w="0" w:type="dxa"/>
-            <w:bottom w:w="0" w:type="dxa"/>
-          </w:tblCellMar>
-        </w:tblPrEx>
         <w:tc>
           <w:tcPr>
             <w:tcW w:w="2000" w:type="dxa"/>
@@ -1177,12 +1117,6 @@
         <w:gridCol w:w="6560"/>
       </w:tblGrid>
       <w:tr>
-        <w:tblPrEx>
-          <w:tblCellMar>
-            <w:top w:w="0" w:type="dxa"/>
-            <w:bottom w:w="0" w:type="dxa"/>
-          </w:tblCellMar>
-        </w:tblPrEx>
         <w:tc>
           <w:tcPr>
             <w:tcW w:w="2800" w:type="dxa"/>
@@ -1244,12 +1178,6 @@
         </w:tc>
       </w:tr>
       <w:tr>
-        <w:tblPrEx>
-          <w:tblCellMar>
-            <w:top w:w="0" w:type="dxa"/>
-            <w:bottom w:w="0" w:type="dxa"/>
-          </w:tblCellMar>
-        </w:tblPrEx>
         <w:tc>
           <w:tcPr>
             <w:tcW w:w="2800" w:type="dxa"/>
@@ -1303,12 +1231,6 @@
         </w:tc>
       </w:tr>
       <w:tr>
-        <w:tblPrEx>
-          <w:tblCellMar>
-            <w:top w:w="0" w:type="dxa"/>
-            <w:bottom w:w="0" w:type="dxa"/>
-          </w:tblCellMar>
-        </w:tblPrEx>
         <w:tc>
           <w:tcPr>
             <w:tcW w:w="2800" w:type="dxa"/>
@@ -1422,12 +1344,6 @@
         <w:gridCol w:w="6560"/>
       </w:tblGrid>
       <w:tr>
-        <w:tblPrEx>
-          <w:tblCellMar>
-            <w:top w:w="0" w:type="dxa"/>
-            <w:bottom w:w="0" w:type="dxa"/>
-          </w:tblCellMar>
-        </w:tblPrEx>
         <w:tc>
           <w:tcPr>
             <w:tcW w:w="2800" w:type="dxa"/>
@@ -1489,12 +1405,6 @@
         </w:tc>
       </w:tr>
       <w:tr>
-        <w:tblPrEx>
-          <w:tblCellMar>
-            <w:top w:w="0" w:type="dxa"/>
-            <w:bottom w:w="0" w:type="dxa"/>
-          </w:tblCellMar>
-        </w:tblPrEx>
         <w:tc>
           <w:tcPr>
             <w:tcW w:w="2800" w:type="dxa"/>
@@ -1556,12 +1466,6 @@
         </w:tc>
       </w:tr>
       <w:tr>
-        <w:tblPrEx>
-          <w:tblCellMar>
-            <w:top w:w="0" w:type="dxa"/>
-            <w:bottom w:w="0" w:type="dxa"/>
-          </w:tblCellMar>
-        </w:tblPrEx>
         <w:tc>
           <w:tcPr>
             <w:tcW w:w="2800" w:type="dxa"/>
@@ -1623,12 +1527,6 @@
         </w:tc>
       </w:tr>
       <w:tr>
-        <w:tblPrEx>
-          <w:tblCellMar>
-            <w:top w:w="0" w:type="dxa"/>
-            <w:bottom w:w="0" w:type="dxa"/>
-          </w:tblCellMar>
-        </w:tblPrEx>
         <w:tc>
           <w:tcPr>
             <w:tcW w:w="2800" w:type="dxa"/>
@@ -1874,12 +1772,6 @@
         <w:gridCol w:w="7360"/>
       </w:tblGrid>
       <w:tr>
-        <w:tblPrEx>
-          <w:tblCellMar>
-            <w:top w:w="0" w:type="dxa"/>
-            <w:bottom w:w="0" w:type="dxa"/>
-          </w:tblCellMar>
-        </w:tblPrEx>
         <w:tc>
           <w:tcPr>
             <w:tcW w:w="2000" w:type="dxa"/>
@@ -1938,12 +1830,6 @@
         </w:tc>
       </w:tr>
       <w:tr>
-        <w:tblPrEx>
-          <w:tblCellMar>
-            <w:top w:w="0" w:type="dxa"/>
-            <w:bottom w:w="0" w:type="dxa"/>
-          </w:tblCellMar>
-        </w:tblPrEx>
         <w:tc>
           <w:tcPr>
             <w:tcW w:w="2000" w:type="dxa"/>
@@ -2005,12 +1891,6 @@
         </w:tc>
       </w:tr>
       <w:tr>
-        <w:tblPrEx>
-          <w:tblCellMar>
-            <w:top w:w="0" w:type="dxa"/>
-            <w:bottom w:w="0" w:type="dxa"/>
-          </w:tblCellMar>
-        </w:tblPrEx>
         <w:tc>
           <w:tcPr>
             <w:tcW w:w="2000" w:type="dxa"/>
@@ -2072,12 +1952,6 @@
         </w:tc>
       </w:tr>
       <w:tr>
-        <w:tblPrEx>
-          <w:tblCellMar>
-            <w:top w:w="0" w:type="dxa"/>
-            <w:bottom w:w="0" w:type="dxa"/>
-          </w:tblCellMar>
-        </w:tblPrEx>
         <w:tc>
           <w:tcPr>
             <w:tcW w:w="2000" w:type="dxa"/>
@@ -2139,12 +2013,6 @@
         </w:tc>
       </w:tr>
       <w:tr>
-        <w:tblPrEx>
-          <w:tblCellMar>
-            <w:top w:w="0" w:type="dxa"/>
-            <w:bottom w:w="0" w:type="dxa"/>
-          </w:tblCellMar>
-        </w:tblPrEx>
         <w:tc>
           <w:tcPr>
             <w:tcW w:w="2000" w:type="dxa"/>

</xml_diff>